<commit_message>
Cahiers d'activités et syllabus alignés : OS du syllabus et codes d'activités communs (A11, A12…, B = bilan)
Co-Authored-By: Claude Opus 5.5 <noreply@anthropic.com>
Claude-Session: https://claude.ai/code/session_016e4mvVAHkX2phRmUpAeQE1
</commit_message>
<xml_diff>
--- a/docs/cahiers/Cahier_activites_Electricite1_Chapitre1.docx
+++ b/docs/cahiers/Cahier_activites_Electricite1_Chapitre1.docx
@@ -613,6 +613,29 @@
           <w:sz w:val="22"/>
           <w:szCs w:val="22"/>
         </w:rPr>
+        <w:t xml:space="preserve">Les objectifs spécifiques (OS) et les codes des activités sont ceux du syllabus de l’EC LPCI1122 : par exemple, A21 est la première activité de l’OS2 ; B1 est le bilan du chapitre.</w:t>
+      </w:r>
+    </w:p>
+    <w:p>
+      <w:pPr>
+        <w:spacing w:before="0" w:after="50" w:line="252" w:lineRule="auto"/>
+        <w:ind w:left="284" w:hanging="284"/>
+        <w:jc w:val="both"/>
+      </w:pPr>
+      <w:r>
+        <w:rPr>
+          <w:rFonts w:ascii="Tahoma" w:hAnsi="Tahoma" w:cs="Tahoma" w:eastAsia="Arial Unicode MS"/>
+          <w:sz w:val="22"/>
+          <w:szCs w:val="22"/>
+        </w:rPr>
+        <w:t xml:space="preserve">• </w:t>
+      </w:r>
+      <w:r>
+        <w:rPr>
+          <w:rFonts w:ascii="Tahoma" w:hAnsi="Tahoma" w:cs="Tahoma" w:eastAsia="Arial Unicode MS"/>
+          <w:sz w:val="22"/>
+          <w:szCs w:val="22"/>
+        </w:rPr>
         <w:t xml:space="preserve">Tous les documents cités (support de cours, diaporama, série de TD et corrigé, quiz, exercices d’entraînement, simulations, TP) se trouvent sur la plateforme physiquefacile.github.io.</w:t>
       </w:r>
     </w:p>
@@ -631,7 +654,7 @@
           <w:szCs w:val="24"/>
           <w:u w:val="single"/>
         </w:rPr>
-        <w:t xml:space="preserve">Objectifs spécifiques du chapitre</w:t>
+        <w:t xml:space="preserve">Objectifs spécifiques du syllabus visés (LPCI1122)</w:t>
       </w:r>
     </w:p>
     <w:p>
@@ -654,6 +677,47 @@
           <w:sz w:val="22"/>
           <w:szCs w:val="22"/>
         </w:rPr>
+        <w:t xml:space="preserve">Décrire les phénomènes électrostatiques et la loi de Coulomb.</w:t>
+      </w:r>
+    </w:p>
+    <w:p>
+      <w:pPr>
+        <w:keepNext/>
+        <w:spacing w:before="150" w:after="70" w:line="252" w:lineRule="auto"/>
+        <w:jc w:val="left"/>
+      </w:pPr>
+      <w:r>
+        <w:rPr>
+          <w:rFonts w:ascii="Tahoma" w:hAnsi="Tahoma" w:cs="Tahoma" w:eastAsia="Arial Unicode MS"/>
+          <w:b/>
+          <w:bCs/>
+          <w:sz w:val="24"/>
+          <w:szCs w:val="24"/>
+          <w:u w:val="single"/>
+        </w:rPr>
+        <w:t xml:space="preserve">Résultats d’apprentissage attendus du chapitre</w:t>
+      </w:r>
+    </w:p>
+    <w:p>
+      <w:pPr>
+        <w:spacing w:before="0" w:after="50" w:line="252" w:lineRule="auto"/>
+        <w:ind w:left="680" w:hanging="680"/>
+        <w:jc w:val="both"/>
+      </w:pPr>
+      <w:r>
+        <w:rPr>
+          <w:rFonts w:ascii="Tahoma" w:hAnsi="Tahoma" w:cs="Tahoma" w:eastAsia="Arial Unicode MS"/>
+          <w:sz w:val="22"/>
+          <w:szCs w:val="22"/>
+        </w:rPr>
+        <w:t xml:space="preserve">(OS1) </w:t>
+      </w:r>
+      <w:r>
+        <w:rPr>
+          <w:rFonts w:ascii="Tahoma" w:hAnsi="Tahoma" w:cs="Tahoma" w:eastAsia="Arial Unicode MS"/>
+          <w:sz w:val="22"/>
+          <w:szCs w:val="22"/>
+        </w:rPr>
         <w:t xml:space="preserve">Expliquer l’origine de la charge électrique ; utiliser sa quantification et sa conservation.</w:t>
       </w:r>
     </w:p>
@@ -669,7 +733,7 @@
           <w:sz w:val="22"/>
           <w:szCs w:val="22"/>
         </w:rPr>
-        <w:t xml:space="preserve">OS2 — </w:t>
+        <w:t xml:space="preserve">(OS1) </w:t>
       </w:r>
       <w:r>
         <w:rPr>
@@ -692,7 +756,7 @@
           <w:sz w:val="22"/>
           <w:szCs w:val="22"/>
         </w:rPr>
-        <w:t xml:space="preserve">OS3 — </w:t>
+        <w:t xml:space="preserve">(OS1) </w:t>
       </w:r>
       <w:r>
         <w:rPr>
@@ -715,7 +779,7 @@
           <w:sz w:val="22"/>
           <w:szCs w:val="22"/>
         </w:rPr>
-        <w:t xml:space="preserve">OS4 — </w:t>
+        <w:t xml:space="preserve">(OS1) </w:t>
       </w:r>
       <w:r>
         <w:rPr>
@@ -738,7 +802,7 @@
           <w:sz w:val="22"/>
           <w:szCs w:val="22"/>
         </w:rPr>
-        <w:t xml:space="preserve">OS5 — </w:t>
+        <w:t xml:space="preserve">(OS1) </w:t>
       </w:r>
       <w:r>
         <w:rPr>
@@ -978,7 +1042,7 @@
                 <w:sz w:val="17"/>
                 <w:szCs w:val="17"/>
               </w:rPr>
-              <w:t xml:space="preserve">A1.1</w:t>
+              <w:t xml:space="preserve">A11</w:t>
             </w:r>
           </w:p>
         </w:tc>
@@ -1103,7 +1167,7 @@
                 <w:sz w:val="17"/>
                 <w:szCs w:val="17"/>
               </w:rPr>
-              <w:t xml:space="preserve">A2.1</w:t>
+              <w:t xml:space="preserve">A12</w:t>
             </w:r>
           </w:p>
         </w:tc>
@@ -1143,7 +1207,7 @@
                 <w:sz w:val="17"/>
                 <w:szCs w:val="17"/>
               </w:rPr>
-              <w:t xml:space="preserve">OS2</w:t>
+              <w:t xml:space="preserve">OS1</w:t>
             </w:r>
           </w:p>
         </w:tc>
@@ -1228,7 +1292,7 @@
                 <w:sz w:val="17"/>
                 <w:szCs w:val="17"/>
               </w:rPr>
-              <w:t xml:space="preserve">A3.1</w:t>
+              <w:t xml:space="preserve">A13</w:t>
             </w:r>
           </w:p>
         </w:tc>
@@ -1268,7 +1332,7 @@
                 <w:sz w:val="17"/>
                 <w:szCs w:val="17"/>
               </w:rPr>
-              <w:t xml:space="preserve">OS3</w:t>
+              <w:t xml:space="preserve">OS1</w:t>
             </w:r>
           </w:p>
         </w:tc>
@@ -1353,7 +1417,7 @@
                 <w:sz w:val="17"/>
                 <w:szCs w:val="17"/>
               </w:rPr>
-              <w:t xml:space="preserve">A4.1</w:t>
+              <w:t xml:space="preserve">A14</w:t>
             </w:r>
           </w:p>
         </w:tc>
@@ -1393,7 +1457,7 @@
                 <w:sz w:val="17"/>
                 <w:szCs w:val="17"/>
               </w:rPr>
-              <w:t xml:space="preserve">OS4</w:t>
+              <w:t xml:space="preserve">OS1</w:t>
             </w:r>
           </w:p>
         </w:tc>
@@ -1478,7 +1542,7 @@
                 <w:sz w:val="17"/>
                 <w:szCs w:val="17"/>
               </w:rPr>
-              <w:t xml:space="preserve">A5.1</w:t>
+              <w:t xml:space="preserve">A15</w:t>
             </w:r>
           </w:p>
         </w:tc>
@@ -1518,7 +1582,7 @@
                 <w:sz w:val="17"/>
                 <w:szCs w:val="17"/>
               </w:rPr>
-              <w:t xml:space="preserve">OS5</w:t>
+              <w:t xml:space="preserve">OS1</w:t>
             </w:r>
           </w:p>
         </w:tc>
@@ -1603,7 +1667,7 @@
                 <w:sz w:val="17"/>
                 <w:szCs w:val="17"/>
               </w:rPr>
-              <w:t xml:space="preserve">A5.2</w:t>
+              <w:t xml:space="preserve">B1</w:t>
             </w:r>
           </w:p>
         </w:tc>
@@ -1643,7 +1707,7 @@
                 <w:sz w:val="17"/>
                 <w:szCs w:val="17"/>
               </w:rPr>
-              <w:t xml:space="preserve">OS1–5</w:t>
+              <w:t xml:space="preserve">OS1</w:t>
             </w:r>
           </w:p>
         </w:tc>
@@ -1796,7 +1860,7 @@
           </w:tcPr>
           <w:p>
             <w:pPr>
-              <w:spacing w:before="0" w:after="0" w:line="252" w:lineRule="auto"/>
+              <w:spacing w:before="0" w:after="60" w:line="252" w:lineRule="auto"/>
               <w:jc w:val="both"/>
             </w:pPr>
             <w:r>
@@ -1806,6 +1870,30 @@
                 <w:szCs w:val="22"/>
               </w:rPr>
               <w:t xml:space="preserve">OS1 — </w:t>
+            </w:r>
+            <w:r>
+              <w:rPr>
+                <w:rFonts w:ascii="Tahoma" w:hAnsi="Tahoma" w:cs="Tahoma" w:eastAsia="Arial Unicode MS"/>
+                <w:sz w:val="22"/>
+                <w:szCs w:val="22"/>
+              </w:rPr>
+              <w:t xml:space="preserve">Décrire les phénomènes électrostatiques et la loi de Coulomb.</w:t>
+            </w:r>
+          </w:p>
+          <w:p>
+            <w:pPr>
+              <w:spacing w:before="0" w:after="0" w:line="252" w:lineRule="auto"/>
+              <w:jc w:val="both"/>
+            </w:pPr>
+            <w:r>
+              <w:rPr>
+                <w:rFonts w:ascii="Tahoma" w:hAnsi="Tahoma" w:cs="Tahoma" w:eastAsia="Arial Unicode MS"/>
+                <w:b/>
+                <w:bCs/>
+                <w:sz w:val="22"/>
+                <w:szCs w:val="22"/>
+              </w:rPr>
+              <w:t xml:space="preserve">Résultat attendu : </w:t>
             </w:r>
             <w:r>
               <w:rPr>
@@ -1842,7 +1930,7 @@
           <w:sz w:val="24"/>
           <w:szCs w:val="24"/>
         </w:rPr>
-        <w:t xml:space="preserve"> A1.1</w:t>
+        <w:t xml:space="preserve"> A11</w:t>
       </w:r>
     </w:p>
     <w:tbl>
@@ -2432,16 +2520,40 @@
           </w:tcPr>
           <w:p>
             <w:pPr>
-              <w:spacing w:before="0" w:after="0" w:line="252" w:lineRule="auto"/>
-              <w:jc w:val="both"/>
-            </w:pPr>
-            <w:r>
-              <w:rPr>
-                <w:rFonts w:ascii="Tahoma" w:hAnsi="Tahoma" w:cs="Tahoma" w:eastAsia="Arial Unicode MS"/>
-                <w:sz w:val="22"/>
-                <w:szCs w:val="22"/>
-              </w:rPr>
-              <w:t xml:space="preserve">OS2 — </w:t>
+              <w:spacing w:before="0" w:after="60" w:line="252" w:lineRule="auto"/>
+              <w:jc w:val="both"/>
+            </w:pPr>
+            <w:r>
+              <w:rPr>
+                <w:rFonts w:ascii="Tahoma" w:hAnsi="Tahoma" w:cs="Tahoma" w:eastAsia="Arial Unicode MS"/>
+                <w:sz w:val="22"/>
+                <w:szCs w:val="22"/>
+              </w:rPr>
+              <w:t xml:space="preserve">OS1 — </w:t>
+            </w:r>
+            <w:r>
+              <w:rPr>
+                <w:rFonts w:ascii="Tahoma" w:hAnsi="Tahoma" w:cs="Tahoma" w:eastAsia="Arial Unicode MS"/>
+                <w:sz w:val="22"/>
+                <w:szCs w:val="22"/>
+              </w:rPr>
+              <w:t xml:space="preserve">Décrire les phénomènes électrostatiques et la loi de Coulomb.</w:t>
+            </w:r>
+          </w:p>
+          <w:p>
+            <w:pPr>
+              <w:spacing w:before="0" w:after="0" w:line="252" w:lineRule="auto"/>
+              <w:jc w:val="both"/>
+            </w:pPr>
+            <w:r>
+              <w:rPr>
+                <w:rFonts w:ascii="Tahoma" w:hAnsi="Tahoma" w:cs="Tahoma" w:eastAsia="Arial Unicode MS"/>
+                <w:b/>
+                <w:bCs/>
+                <w:sz w:val="22"/>
+                <w:szCs w:val="22"/>
+              </w:rPr>
+              <w:t xml:space="preserve">Résultat attendu : </w:t>
             </w:r>
             <w:r>
               <w:rPr>
@@ -2478,7 +2590,7 @@
           <w:sz w:val="24"/>
           <w:szCs w:val="24"/>
         </w:rPr>
-        <w:t xml:space="preserve"> A2.1</w:t>
+        <w:t xml:space="preserve"> A12</w:t>
       </w:r>
     </w:p>
     <w:tbl>
@@ -3176,16 +3288,40 @@
           </w:tcPr>
           <w:p>
             <w:pPr>
-              <w:spacing w:before="0" w:after="0" w:line="252" w:lineRule="auto"/>
-              <w:jc w:val="both"/>
-            </w:pPr>
-            <w:r>
-              <w:rPr>
-                <w:rFonts w:ascii="Tahoma" w:hAnsi="Tahoma" w:cs="Tahoma" w:eastAsia="Arial Unicode MS"/>
-                <w:sz w:val="22"/>
-                <w:szCs w:val="22"/>
-              </w:rPr>
-              <w:t xml:space="preserve">OS3 — </w:t>
+              <w:spacing w:before="0" w:after="60" w:line="252" w:lineRule="auto"/>
+              <w:jc w:val="both"/>
+            </w:pPr>
+            <w:r>
+              <w:rPr>
+                <w:rFonts w:ascii="Tahoma" w:hAnsi="Tahoma" w:cs="Tahoma" w:eastAsia="Arial Unicode MS"/>
+                <w:sz w:val="22"/>
+                <w:szCs w:val="22"/>
+              </w:rPr>
+              <w:t xml:space="preserve">OS1 — </w:t>
+            </w:r>
+            <w:r>
+              <w:rPr>
+                <w:rFonts w:ascii="Tahoma" w:hAnsi="Tahoma" w:cs="Tahoma" w:eastAsia="Arial Unicode MS"/>
+                <w:sz w:val="22"/>
+                <w:szCs w:val="22"/>
+              </w:rPr>
+              <w:t xml:space="preserve">Décrire les phénomènes électrostatiques et la loi de Coulomb.</w:t>
+            </w:r>
+          </w:p>
+          <w:p>
+            <w:pPr>
+              <w:spacing w:before="0" w:after="0" w:line="252" w:lineRule="auto"/>
+              <w:jc w:val="both"/>
+            </w:pPr>
+            <w:r>
+              <w:rPr>
+                <w:rFonts w:ascii="Tahoma" w:hAnsi="Tahoma" w:cs="Tahoma" w:eastAsia="Arial Unicode MS"/>
+                <w:b/>
+                <w:bCs/>
+                <w:sz w:val="22"/>
+                <w:szCs w:val="22"/>
+              </w:rPr>
+              <w:t xml:space="preserve">Résultat attendu : </w:t>
             </w:r>
             <w:r>
               <w:rPr>
@@ -3222,7 +3358,7 @@
           <w:sz w:val="24"/>
           <w:szCs w:val="24"/>
         </w:rPr>
-        <w:t xml:space="preserve"> A3.1</w:t>
+        <w:t xml:space="preserve"> A13</w:t>
       </w:r>
     </w:p>
     <w:tbl>
@@ -3824,16 +3960,40 @@
           </w:tcPr>
           <w:p>
             <w:pPr>
-              <w:spacing w:before="0" w:after="0" w:line="252" w:lineRule="auto"/>
-              <w:jc w:val="both"/>
-            </w:pPr>
-            <w:r>
-              <w:rPr>
-                <w:rFonts w:ascii="Tahoma" w:hAnsi="Tahoma" w:cs="Tahoma" w:eastAsia="Arial Unicode MS"/>
-                <w:sz w:val="22"/>
-                <w:szCs w:val="22"/>
-              </w:rPr>
-              <w:t xml:space="preserve">OS4 — </w:t>
+              <w:spacing w:before="0" w:after="60" w:line="252" w:lineRule="auto"/>
+              <w:jc w:val="both"/>
+            </w:pPr>
+            <w:r>
+              <w:rPr>
+                <w:rFonts w:ascii="Tahoma" w:hAnsi="Tahoma" w:cs="Tahoma" w:eastAsia="Arial Unicode MS"/>
+                <w:sz w:val="22"/>
+                <w:szCs w:val="22"/>
+              </w:rPr>
+              <w:t xml:space="preserve">OS1 — </w:t>
+            </w:r>
+            <w:r>
+              <w:rPr>
+                <w:rFonts w:ascii="Tahoma" w:hAnsi="Tahoma" w:cs="Tahoma" w:eastAsia="Arial Unicode MS"/>
+                <w:sz w:val="22"/>
+                <w:szCs w:val="22"/>
+              </w:rPr>
+              <w:t xml:space="preserve">Décrire les phénomènes électrostatiques et la loi de Coulomb.</w:t>
+            </w:r>
+          </w:p>
+          <w:p>
+            <w:pPr>
+              <w:spacing w:before="0" w:after="0" w:line="252" w:lineRule="auto"/>
+              <w:jc w:val="both"/>
+            </w:pPr>
+            <w:r>
+              <w:rPr>
+                <w:rFonts w:ascii="Tahoma" w:hAnsi="Tahoma" w:cs="Tahoma" w:eastAsia="Arial Unicode MS"/>
+                <w:b/>
+                <w:bCs/>
+                <w:sz w:val="22"/>
+                <w:szCs w:val="22"/>
+              </w:rPr>
+              <w:t xml:space="preserve">Résultat attendu : </w:t>
             </w:r>
             <w:r>
               <w:rPr>
@@ -3870,7 +4030,7 @@
           <w:sz w:val="24"/>
           <w:szCs w:val="24"/>
         </w:rPr>
-        <w:t xml:space="preserve"> A4.1</w:t>
+        <w:t xml:space="preserve"> A14</w:t>
       </w:r>
     </w:p>
     <w:tbl>
@@ -4460,16 +4620,40 @@
           </w:tcPr>
           <w:p>
             <w:pPr>
-              <w:spacing w:before="0" w:after="0" w:line="252" w:lineRule="auto"/>
-              <w:jc w:val="both"/>
-            </w:pPr>
-            <w:r>
-              <w:rPr>
-                <w:rFonts w:ascii="Tahoma" w:hAnsi="Tahoma" w:cs="Tahoma" w:eastAsia="Arial Unicode MS"/>
-                <w:sz w:val="22"/>
-                <w:szCs w:val="22"/>
-              </w:rPr>
-              <w:t xml:space="preserve">OS5 — </w:t>
+              <w:spacing w:before="0" w:after="60" w:line="252" w:lineRule="auto"/>
+              <w:jc w:val="both"/>
+            </w:pPr>
+            <w:r>
+              <w:rPr>
+                <w:rFonts w:ascii="Tahoma" w:hAnsi="Tahoma" w:cs="Tahoma" w:eastAsia="Arial Unicode MS"/>
+                <w:sz w:val="22"/>
+                <w:szCs w:val="22"/>
+              </w:rPr>
+              <w:t xml:space="preserve">OS1 — </w:t>
+            </w:r>
+            <w:r>
+              <w:rPr>
+                <w:rFonts w:ascii="Tahoma" w:hAnsi="Tahoma" w:cs="Tahoma" w:eastAsia="Arial Unicode MS"/>
+                <w:sz w:val="22"/>
+                <w:szCs w:val="22"/>
+              </w:rPr>
+              <w:t xml:space="preserve">Décrire les phénomènes électrostatiques et la loi de Coulomb.</w:t>
+            </w:r>
+          </w:p>
+          <w:p>
+            <w:pPr>
+              <w:spacing w:before="0" w:after="0" w:line="252" w:lineRule="auto"/>
+              <w:jc w:val="both"/>
+            </w:pPr>
+            <w:r>
+              <w:rPr>
+                <w:rFonts w:ascii="Tahoma" w:hAnsi="Tahoma" w:cs="Tahoma" w:eastAsia="Arial Unicode MS"/>
+                <w:b/>
+                <w:bCs/>
+                <w:sz w:val="22"/>
+                <w:szCs w:val="22"/>
+              </w:rPr>
+              <w:t xml:space="preserve">Résultat attendu : </w:t>
             </w:r>
             <w:r>
               <w:rPr>
@@ -4506,7 +4690,7 @@
           <w:sz w:val="24"/>
           <w:szCs w:val="24"/>
         </w:rPr>
-        <w:t xml:space="preserve"> A5.1</w:t>
+        <w:t xml:space="preserve"> A15</w:t>
       </w:r>
     </w:p>
     <w:tbl>
@@ -5179,7 +5363,7 @@
           </w:tcPr>
           <w:p>
             <w:pPr>
-              <w:spacing w:before="0" w:after="0" w:line="252" w:lineRule="auto"/>
+              <w:spacing w:before="0" w:after="60" w:line="252" w:lineRule="auto"/>
               <w:jc w:val="both"/>
             </w:pPr>
             <w:r>
@@ -5197,6 +5381,30 @@
                 <w:szCs w:val="22"/>
               </w:rPr>
               <w:t xml:space="preserve">Mobiliser l’ensemble des compétences du chapitre (objectifs spécifiques 1 à 5) et évaluer sa propre maîtrise.</w:t>
+            </w:r>
+          </w:p>
+          <w:p>
+            <w:pPr>
+              <w:spacing w:before="0" w:after="0" w:line="252" w:lineRule="auto"/>
+              <w:jc w:val="both"/>
+            </w:pPr>
+            <w:r>
+              <w:rPr>
+                <w:rFonts w:ascii="Tahoma" w:hAnsi="Tahoma" w:cs="Tahoma" w:eastAsia="Arial Unicode MS"/>
+                <w:b/>
+                <w:bCs/>
+                <w:sz w:val="22"/>
+                <w:szCs w:val="22"/>
+              </w:rPr>
+              <w:t xml:space="preserve">OS visés : </w:t>
+            </w:r>
+            <w:r>
+              <w:rPr>
+                <w:rFonts w:ascii="Tahoma" w:hAnsi="Tahoma" w:cs="Tahoma" w:eastAsia="Arial Unicode MS"/>
+                <w:sz w:val="22"/>
+                <w:szCs w:val="22"/>
+              </w:rPr>
+              <w:t xml:space="preserve">OS1</w:t>
             </w:r>
           </w:p>
         </w:tc>
@@ -5225,7 +5433,7 @@
           <w:sz w:val="24"/>
           <w:szCs w:val="24"/>
         </w:rPr>
-        <w:t xml:space="preserve"> A5.2</w:t>
+        <w:t xml:space="preserve"> B1</w:t>
       </w:r>
     </w:p>
     <w:tbl>
@@ -5873,7 +6081,7 @@
                 <w:sz w:val="20"/>
                 <w:szCs w:val="20"/>
               </w:rPr>
-              <w:t xml:space="preserve">Compétence (objectif spécifique)</w:t>
+              <w:t xml:space="preserve">Compétence (OS du syllabus)</w:t>
             </w:r>
           </w:p>
         </w:tc>
@@ -6027,7 +6235,7 @@
                 <w:sz w:val="20"/>
                 <w:szCs w:val="20"/>
               </w:rPr>
-              <w:t xml:space="preserve">Activité A1.1 ; support § 1.1</w:t>
+              <w:t xml:space="preserve">Activité A11 ; support § 1.1</w:t>
             </w:r>
           </w:p>
         </w:tc>
@@ -6052,7 +6260,7 @@
                 <w:sz w:val="20"/>
                 <w:szCs w:val="20"/>
               </w:rPr>
-              <w:t xml:space="preserve">OS2 — Électrisation, conducteurs et isolants</w:t>
+              <w:t xml:space="preserve">OS1 — Électrisation, conducteurs et isolants</w:t>
             </w:r>
           </w:p>
         </w:tc>
@@ -6112,7 +6320,7 @@
                 <w:sz w:val="20"/>
                 <w:szCs w:val="20"/>
               </w:rPr>
-              <w:t xml:space="preserve">Activité A2.1 ; support § 1.2</w:t>
+              <w:t xml:space="preserve">Activité A12 ; support § 1.2</w:t>
             </w:r>
           </w:p>
         </w:tc>
@@ -6137,7 +6345,7 @@
                 <w:sz w:val="20"/>
                 <w:szCs w:val="20"/>
               </w:rPr>
-              <w:t xml:space="preserve">OS3 — Densités de charge, charge totale</w:t>
+              <w:t xml:space="preserve">OS1 — Densités de charge, charge totale</w:t>
             </w:r>
           </w:p>
         </w:tc>
@@ -6197,7 +6405,7 @@
                 <w:sz w:val="20"/>
                 <w:szCs w:val="20"/>
               </w:rPr>
-              <w:t xml:space="preserve">Activité A3.1 ; support § 1.3</w:t>
+              <w:t xml:space="preserve">Activité A13 ; support § 1.3</w:t>
             </w:r>
           </w:p>
         </w:tc>
@@ -6222,7 +6430,7 @@
                 <w:sz w:val="20"/>
                 <w:szCs w:val="20"/>
               </w:rPr>
-              <w:t xml:space="preserve">OS4 — Loi de Coulomb</w:t>
+              <w:t xml:space="preserve">OS1 — Loi de Coulomb</w:t>
             </w:r>
           </w:p>
         </w:tc>
@@ -6282,7 +6490,7 @@
                 <w:sz w:val="20"/>
                 <w:szCs w:val="20"/>
               </w:rPr>
-              <w:t xml:space="preserve">Activité A4.1 ; support § 1.4</w:t>
+              <w:t xml:space="preserve">Activité A14 ; support § 1.4</w:t>
             </w:r>
           </w:p>
         </w:tc>
@@ -6307,7 +6515,7 @@
                 <w:sz w:val="20"/>
                 <w:szCs w:val="20"/>
               </w:rPr>
-              <w:t xml:space="preserve">OS5 — Principe de superposition</w:t>
+              <w:t xml:space="preserve">OS1 — Principe de superposition</w:t>
             </w:r>
           </w:p>
         </w:tc>
@@ -6367,7 +6575,7 @@
                 <w:sz w:val="20"/>
                 <w:szCs w:val="20"/>
               </w:rPr>
-              <w:t xml:space="preserve">Activité A5.1 ; support § 1.4</w:t>
+              <w:t xml:space="preserve">Activité A15 ; support § 1.4</w:t>
             </w:r>
           </w:p>
         </w:tc>

</xml_diff>